<commit_message>
Publish unversioned downloads with bilingual home page and corrected guides
</commit_message>
<xml_diff>
--- a/distribution/English_User_Guide.docx
+++ b/distribution/English_User_Guide.docx
@@ -61,7 +61,7 @@
         <w:rPr>
           <w:lang w:val="en-US"/>
         </w:rPr>
-        <w:t>Extract the downloaded archive into a separate folder. Run Install-Manager.cmd, select your game directory in the setup wizard, and install any missing components as prompted.</w:t>
+        <w:t>Extract the downloaded archive into a separate folder. Run Setup.cmd, select your game directory in the setup wizard, and install any missing components as prompted.</w:t>
       </w:r>
     </w:p>
     <w:p>
@@ -194,7 +194,7 @@
                 <w:color w:val="1B3C5A"/>
                 <w:sz w:val="16"/>
               </w:rPr>
-              <w:t>cmd /d /c "set EOS_USE_ANTICHEATCLIENTNULL=1&amp;&amp; %command% -anticheat_settings=AC8Kamome_Offline.json"</w:t>
+              <w:t>cmd /d /c "set EOS_USE_ANTICHEATCLIENTNULL=1&amp;&amp; %command% -anticheat_settings=AC8SkinManager_Offline.json"</w:t>
             </w:r>
           </w:p>
         </w:tc>

</xml_diff>